<commit_message>
feature: envío automático de cartas de asignación por correo
</commit_message>
<xml_diff>
--- a/coda-src/plantillas_ejemplo/carta_asignacion_tutor_plantilla.docx
+++ b/coda-src/plantillas_ejemplo/carta_asignacion_tutor_plantilla.docx
@@ -101,7 +101,7 @@
         <mc:AlternateContent>
           <mc:Choice Requires="wpg">
             <w:drawing>
-              <wp:anchor distT="0" distB="0" distL="0" distR="0" simplePos="0" relativeHeight="2" behindDoc="0" locked="0" layoutInCell="1" allowOverlap="1">
+              <wp:anchor distT="0" distB="0" distL="0" distR="0" simplePos="0" relativeHeight="7" behindDoc="0" locked="0" layoutInCell="1" allowOverlap="1">
                 <wp:simplePos x="0" y="0"/>
                 <wp:positionH relativeFrom="column">
                   <wp:posOffset>101600</wp:posOffset>
@@ -171,7 +171,7 @@
                               </w:p>
                             </w:txbxContent>
                           </wps:txbx>
-                          <wps:bodyPr tIns="91440" bIns="91440" anchor="ctr">
+                          <wps:bodyPr lIns="0" tIns="0" rIns="0" bIns="0" anchor="ctr">
                             <a:noAutofit/>
                           </wps:bodyPr>
                         </wps:wsp>
@@ -237,7 +237,7 @@
                             <pic:spPr>
                               <a:xfrm>
                                 <a:off x="0" y="0"/>
-                                <a:ext cx="1039320" cy="555480"/>
+                                <a:ext cx="1038960" cy="555480"/>
                               </a:xfrm>
                               <a:prstGeom prst="rect">
                                 <a:avLst/>
@@ -259,8 +259,8 @@
                             </pic:blipFill>
                             <pic:spPr>
                               <a:xfrm>
-                                <a:off x="1050840" y="415800"/>
-                                <a:ext cx="1640880" cy="286920"/>
+                                <a:off x="1050840" y="416520"/>
+                                <a:ext cx="1640880" cy="286560"/>
                               </a:xfrm>
                               <a:prstGeom prst="rect">
                                 <a:avLst/>
@@ -345,12 +345,12 @@
                       <v:path o:extrusionok="f" gradientshapeok="t" o:connecttype="rect"/>
                       <o:lock v:ext="edit" aspectratio="t"/>
                     </v:shapetype>
-                    <v:shape id="shape_0" stroked="f" o:allowincell="f" style="position:absolute;left:160;top:-860;width:1636;height:874;mso-wrap-style:none;v-text-anchor:middle" type="_x0000_t75">
+                    <v:shape id="shape_0" stroked="f" o:allowincell="f" style="position:absolute;left:160;top:-860;width:1635;height:874;mso-wrap-style:none;v-text-anchor:middle" type="_x0000_t75">
                       <v:imagedata r:id="rId4" o:detectmouseclick="t"/>
                       <v:stroke color="#3465a4" joinstyle="round" endcap="flat"/>
                       <w10:wrap type="none"/>
                     </v:shape>
-                    <v:shape id="shape_0" stroked="f" o:allowincell="f" style="position:absolute;left:1815;top:-205;width:2583;height:451;mso-wrap-style:none;v-text-anchor:middle" type="_x0000_t75">
+                    <v:shape id="shape_0" stroked="f" o:allowincell="f" style="position:absolute;left:1815;top:-204;width:2583;height:450;mso-wrap-style:none;v-text-anchor:middle" type="_x0000_t75">
                       <v:imagedata r:id="rId5" o:detectmouseclick="t"/>
                       <v:stroke color="#3465a4" joinstyle="round" endcap="flat"/>
                       <w10:wrap type="none"/>
@@ -489,7 +489,7 @@
                               </w:p>
                             </w:txbxContent>
                           </wps:txbx>
-                          <wps:bodyPr tIns="33120" bIns="33120" anchor="ctr">
+                          <wps:bodyPr lIns="0" tIns="0" rIns="0" bIns="0" anchor="ctr">
                             <a:noAutofit/>
                           </wps:bodyPr>
                         </wps:wsp>
@@ -782,17 +782,37 @@
         <w:ind w:hanging="1088" w:start="5529" w:end="136"/>
         <w:jc w:val="end"/>
         <w:rPr>
+          <w:sz w:val="20"/>
+          <w:szCs w:val="20"/>
+        </w:rPr>
+      </w:pPr>
+      <w:r>
+        <w:rPr>
+          <w:rFonts w:eastAsia="Times New Roman" w:cs="Times New Roman" w:ascii="Times New Roman" w:hAnsi="Times New Roman"/>
+          <w:sz w:val="20"/>
+          <w:szCs w:val="20"/>
           <w:shd w:fill="auto" w:val="clear"/>
         </w:rPr>
-      </w:pPr>
-      <w:r>
-        <w:rPr>
-          <w:rFonts w:eastAsia="Times New Roman" w:cs="Times New Roman" w:ascii="Times New Roman" w:hAnsi="Times New Roman"/>
+        <w:t>Ciudad de México a {fecha}</w:t>
+      </w:r>
+    </w:p>
+    <w:p>
+      <w:pPr>
+        <w:pStyle w:val="normal1"/>
+        <w:ind w:hanging="1088" w:start="5529" w:end="136"/>
+        <w:jc w:val="end"/>
+        <w:rPr>
+          <w:rFonts w:ascii="Times New Roman" w:hAnsi="Times New Roman" w:eastAsia="Times New Roman" w:cs="Times New Roman"/>
           <w:sz w:val="18"/>
           <w:szCs w:val="18"/>
-          <w:shd w:fill="auto" w:val="clear"/>
-        </w:rPr>
-        <w:t>Ciudad de México a {fecha}</w:t>
+        </w:rPr>
+      </w:pPr>
+      <w:r>
+        <w:rPr>
+          <w:rFonts w:eastAsia="Times New Roman" w:cs="Times New Roman" w:ascii="Times New Roman" w:hAnsi="Times New Roman"/>
+          <w:sz w:val="18"/>
+          <w:szCs w:val="18"/>
+        </w:rPr>
       </w:r>
     </w:p>
     <w:p>
@@ -801,35 +821,15 @@
         <w:ind w:hanging="1088" w:start="5529" w:end="136"/>
         <w:jc w:val="end"/>
         <w:rPr>
-          <w:rFonts w:ascii="Times New Roman" w:hAnsi="Times New Roman" w:eastAsia="Times New Roman" w:cs="Times New Roman"/>
-          <w:sz w:val="18"/>
-          <w:szCs w:val="18"/>
-        </w:rPr>
-      </w:pPr>
-      <w:r>
-        <w:rPr>
-          <w:rFonts w:eastAsia="Times New Roman" w:cs="Times New Roman" w:ascii="Times New Roman" w:hAnsi="Times New Roman"/>
-          <w:sz w:val="18"/>
-          <w:szCs w:val="18"/>
-        </w:rPr>
-      </w:r>
-    </w:p>
-    <w:p>
-      <w:pPr>
-        <w:pStyle w:val="normal1"/>
-        <w:ind w:hanging="1088" w:start="5529" w:end="136"/>
-        <w:jc w:val="end"/>
-        <w:rPr>
-          <w:rFonts w:ascii="Times New Roman" w:hAnsi="Times New Roman" w:eastAsia="Times New Roman" w:cs="Times New Roman"/>
-          <w:sz w:val="18"/>
-          <w:szCs w:val="18"/>
-        </w:rPr>
-      </w:pPr>
-      <w:r>
-        <w:rPr>
-          <w:rFonts w:eastAsia="Times New Roman" w:cs="Times New Roman" w:ascii="Times New Roman" w:hAnsi="Times New Roman"/>
-          <w:sz w:val="18"/>
-          <w:szCs w:val="18"/>
+          <w:sz w:val="20"/>
+          <w:szCs w:val="20"/>
+        </w:rPr>
+      </w:pPr>
+      <w:r>
+        <w:rPr>
+          <w:rFonts w:eastAsia="Times New Roman" w:cs="Times New Roman" w:ascii="Times New Roman" w:hAnsi="Times New Roman"/>
+          <w:sz w:val="20"/>
+          <w:szCs w:val="20"/>
         </w:rPr>
         <w:t>Asunto : Asignación de tutorados</w:t>
       </w:r>
@@ -922,10 +922,7 @@
         <w:pStyle w:val="normal1"/>
         <w:spacing w:lineRule="auto" w:line="240" w:before="7" w:after="0"/>
         <w:jc w:val="both"/>
-        <w:rPr>
-          <w:rFonts w:ascii="Times New Roman" w:hAnsi="Times New Roman" w:eastAsia="Times New Roman" w:cs="Times New Roman"/>
-          <w:color w:val="000000"/>
-        </w:rPr>
+        <w:rPr/>
       </w:pPr>
       <w:r>
         <w:rPr>
@@ -940,7 +937,35 @@
           <w:rFonts w:eastAsia="Times New Roman" w:cs="Times New Roman" w:ascii="Times New Roman" w:hAnsi="Times New Roman"/>
           <w:color w:val="000000"/>
         </w:rPr>
-        <w:t>, como parte del Sistema de Acompañamiento al Alumnado que desarrolla la Universidad Autónoma Metropolitana Unidad Cuajimalpa y con la finalidad de propiciar el buen desempeño académico de nuestros alumnos y alumnas desde su ingreso a la Universidad y hasta la conclusión de sus estudios, le comunico que tiene asignados los siguientes miembros del alumnado de la licenciatura en {licenciatura} para su Tutoría y Asesoría.</w:t>
+        <w:t xml:space="preserve">, como parte del Sistema de Acompañamiento al Alumnado que desarrolla la Universidad Autónoma Metropolitana Unidad Cuajimalpa y con la finalidad de propiciar el buen desempeño académico de nuestros alumnos y alumnas desde su ingreso a la Universidad y hasta la conclusión de sus estudios, le comunico que tiene asignados los siguientes miembros del alumnado de la licenciatura en {licenciatura} para su </w:t>
+      </w:r>
+      <w:r>
+        <w:rPr>
+          <w:rFonts w:eastAsia="Times New Roman" w:cs="Times New Roman" w:ascii="Times New Roman" w:hAnsi="Times New Roman"/>
+          <w:color w:val="000000"/>
+        </w:rPr>
+        <w:t>t</w:t>
+      </w:r>
+      <w:r>
+        <w:rPr>
+          <w:rFonts w:eastAsia="Times New Roman" w:cs="Times New Roman" w:ascii="Times New Roman" w:hAnsi="Times New Roman"/>
+          <w:color w:val="000000"/>
+        </w:rPr>
+        <w:t xml:space="preserve">utoría y </w:t>
+      </w:r>
+      <w:r>
+        <w:rPr>
+          <w:rFonts w:eastAsia="Times New Roman" w:cs="Times New Roman" w:ascii="Times New Roman" w:hAnsi="Times New Roman"/>
+          <w:color w:val="000000"/>
+        </w:rPr>
+        <w:t>a</w:t>
+      </w:r>
+      <w:r>
+        <w:rPr>
+          <w:rFonts w:eastAsia="Times New Roman" w:cs="Times New Roman" w:ascii="Times New Roman" w:hAnsi="Times New Roman"/>
+          <w:color w:val="000000"/>
+        </w:rPr>
+        <w:t>sesoría.</w:t>
       </w:r>
     </w:p>
     <w:p>
@@ -992,10 +1017,10 @@
       </w:tblPr>
       <w:tblGrid>
         <w:gridCol w:w="1095"/>
-        <w:gridCol w:w="1695"/>
-        <w:gridCol w:w="1890"/>
-        <w:gridCol w:w="2070"/>
-        <w:gridCol w:w="2175"/>
+        <w:gridCol w:w="1694"/>
+        <w:gridCol w:w="1891"/>
+        <w:gridCol w:w="2069"/>
+        <w:gridCol w:w="2176"/>
       </w:tblGrid>
       <w:tr>
         <w:trPr>
@@ -1004,6 +1029,139 @@
         <w:tc>
           <w:tcPr>
             <w:tcW w:w="1095" w:type="dxa"/>
+            <w:tcBorders>
+              <w:top w:val="single" w:sz="4" w:space="0" w:color="000000"/>
+              <w:start w:val="single" w:sz="4" w:space="0" w:color="000000"/>
+              <w:bottom w:val="single" w:sz="4" w:space="0" w:color="000000"/>
+            </w:tcBorders>
+            <w:shd w:fill="FAC090" w:val="clear"/>
+            <w:vAlign w:val="center"/>
+          </w:tcPr>
+          <w:p>
+            <w:pPr>
+              <w:pStyle w:val="normal1"/>
+              <w:widowControl/>
+              <w:rPr>
+                <w:b/>
+                <w:bCs/>
+              </w:rPr>
+            </w:pPr>
+            <w:r>
+              <w:rPr>
+                <w:rFonts w:eastAsia="Times New Roman" w:cs="Times New Roman" w:ascii="Times New Roman" w:hAnsi="Times New Roman"/>
+                <w:b/>
+                <w:bCs/>
+                <w:color w:val="000000"/>
+                <w:sz w:val="20"/>
+                <w:szCs w:val="20"/>
+              </w:rPr>
+              <w:t>Trimestre ingreso</w:t>
+            </w:r>
+          </w:p>
+        </w:tc>
+        <w:tc>
+          <w:tcPr>
+            <w:tcW w:w="1694" w:type="dxa"/>
+            <w:tcBorders>
+              <w:top w:val="single" w:sz="4" w:space="0" w:color="000000"/>
+              <w:start w:val="single" w:sz="4" w:space="0" w:color="000000"/>
+              <w:bottom w:val="single" w:sz="4" w:space="0" w:color="000000"/>
+            </w:tcBorders>
+            <w:shd w:fill="FAC090" w:val="clear"/>
+            <w:vAlign w:val="center"/>
+          </w:tcPr>
+          <w:p>
+            <w:pPr>
+              <w:pStyle w:val="normal1"/>
+              <w:widowControl/>
+              <w:jc w:val="center"/>
+              <w:rPr>
+                <w:b/>
+                <w:bCs/>
+              </w:rPr>
+            </w:pPr>
+            <w:r>
+              <w:rPr>
+                <w:rFonts w:eastAsia="Times New Roman" w:cs="Times New Roman" w:ascii="Times New Roman" w:hAnsi="Times New Roman"/>
+                <w:b/>
+                <w:bCs/>
+                <w:color w:val="000000"/>
+                <w:sz w:val="20"/>
+                <w:szCs w:val="20"/>
+              </w:rPr>
+              <w:t>Matrícula</w:t>
+            </w:r>
+          </w:p>
+        </w:tc>
+        <w:tc>
+          <w:tcPr>
+            <w:tcW w:w="1891" w:type="dxa"/>
+            <w:tcBorders>
+              <w:top w:val="single" w:sz="4" w:space="0" w:color="000000"/>
+              <w:start w:val="single" w:sz="4" w:space="0" w:color="000000"/>
+              <w:bottom w:val="single" w:sz="4" w:space="0" w:color="000000"/>
+            </w:tcBorders>
+            <w:shd w:fill="FAC090" w:val="clear"/>
+            <w:vAlign w:val="center"/>
+          </w:tcPr>
+          <w:p>
+            <w:pPr>
+              <w:pStyle w:val="normal1"/>
+              <w:widowControl/>
+              <w:rPr>
+                <w:b/>
+                <w:bCs/>
+              </w:rPr>
+            </w:pPr>
+            <w:r>
+              <w:rPr>
+                <w:rFonts w:eastAsia="Times New Roman" w:cs="Times New Roman" w:ascii="Times New Roman" w:hAnsi="Times New Roman"/>
+                <w:b/>
+                <w:bCs/>
+                <w:color w:val="000000"/>
+                <w:sz w:val="20"/>
+                <w:szCs w:val="20"/>
+              </w:rPr>
+              <w:t>Apellido paterno</w:t>
+            </w:r>
+          </w:p>
+        </w:tc>
+        <w:tc>
+          <w:tcPr>
+            <w:tcW w:w="2069" w:type="dxa"/>
+            <w:tcBorders>
+              <w:top w:val="single" w:sz="4" w:space="0" w:color="000000"/>
+              <w:start w:val="single" w:sz="4" w:space="0" w:color="000000"/>
+              <w:bottom w:val="single" w:sz="4" w:space="0" w:color="000000"/>
+            </w:tcBorders>
+            <w:shd w:fill="FAC090" w:val="clear"/>
+            <w:vAlign w:val="center"/>
+          </w:tcPr>
+          <w:p>
+            <w:pPr>
+              <w:pStyle w:val="normal1"/>
+              <w:widowControl/>
+              <w:rPr>
+                <w:b/>
+                <w:bCs/>
+              </w:rPr>
+            </w:pPr>
+            <w:r>
+              <w:rPr>
+                <w:rFonts w:eastAsia="Times New Roman" w:cs="Times New Roman" w:ascii="Times New Roman" w:hAnsi="Times New Roman"/>
+                <w:b/>
+                <w:bCs/>
+                <w:color w:val="000000"/>
+                <w:sz w:val="20"/>
+                <w:szCs w:val="20"/>
+              </w:rPr>
+              <w:t>Apellido materno</w:t>
+            </w:r>
+          </w:p>
+        </w:tc>
+        <w:tc>
+          <w:tcPr>
+            <w:tcW w:w="2176" w:type="dxa"/>
             <w:tcBorders>
               <w:top w:val="single" w:sz="4" w:space="0" w:color="000000"/>
               <w:start w:val="single" w:sz="4" w:space="0" w:color="000000"/>
@@ -1018,41 +1176,36 @@
               <w:pStyle w:val="normal1"/>
               <w:widowControl/>
               <w:rPr>
-                <w:rFonts w:ascii="Times New Roman" w:hAnsi="Times New Roman" w:eastAsia="Times New Roman" w:cs="Times New Roman"/>
-                <w:color w:val="000000"/>
-                <w:sz w:val="20"/>
-                <w:szCs w:val="20"/>
+                <w:b/>
+                <w:bCs/>
               </w:rPr>
             </w:pPr>
             <w:r>
               <w:rPr>
                 <w:rFonts w:eastAsia="Times New Roman" w:cs="Times New Roman" w:ascii="Times New Roman" w:hAnsi="Times New Roman"/>
+                <w:b/>
+                <w:bCs/>
                 <w:color w:val="000000"/>
                 <w:sz w:val="20"/>
                 <w:szCs w:val="20"/>
               </w:rPr>
-              <w:t xml:space="preserve">Trimestre </w:t>
-            </w:r>
-            <w:r>
-              <w:rPr>
-                <w:rFonts w:eastAsia="Times New Roman" w:cs="Times New Roman" w:ascii="Times New Roman" w:hAnsi="Times New Roman"/>
-                <w:color w:val="000000"/>
-                <w:sz w:val="20"/>
-                <w:szCs w:val="20"/>
-              </w:rPr>
-              <w:t>ingreso</w:t>
+              <w:t>Nombre</w:t>
             </w:r>
           </w:p>
         </w:tc>
+      </w:tr>
+      <w:tr>
+        <w:trPr>
+          <w:trHeight w:val="372" w:hRule="atLeast"/>
+        </w:trPr>
         <w:tc>
           <w:tcPr>
-            <w:tcW w:w="1695" w:type="dxa"/>
+            <w:tcW w:w="1095" w:type="dxa"/>
             <w:tcBorders>
-              <w:top w:val="single" w:sz="4" w:space="0" w:color="000000"/>
+              <w:start w:val="single" w:sz="4" w:space="0" w:color="000000"/>
               <w:bottom w:val="single" w:sz="4" w:space="0" w:color="000000"/>
-              <w:end w:val="single" w:sz="4" w:space="0" w:color="000000"/>
             </w:tcBorders>
-            <w:shd w:fill="FAC090" w:val="clear"/>
+            <w:shd w:fill="FFFFFF" w:val="clear"/>
             <w:vAlign w:val="center"/>
           </w:tcPr>
           <w:p>
@@ -1062,31 +1215,71 @@
               <w:jc w:val="center"/>
               <w:rPr>
                 <w:rFonts w:ascii="Times New Roman" w:hAnsi="Times New Roman" w:eastAsia="Times New Roman" w:cs="Times New Roman"/>
+                <w:b w:val="false"/>
+                <w:bCs w:val="false"/>
                 <w:color w:val="000000"/>
-                <w:sz w:val="20"/>
-                <w:szCs w:val="20"/>
+                <w:sz w:val="18"/>
+                <w:szCs w:val="18"/>
               </w:rPr>
             </w:pPr>
             <w:r>
               <w:rPr>
                 <w:rFonts w:eastAsia="Times New Roman" w:cs="Times New Roman" w:ascii="Times New Roman" w:hAnsi="Times New Roman"/>
+                <w:b w:val="false"/>
+                <w:bCs w:val="false"/>
                 <w:color w:val="000000"/>
-                <w:sz w:val="20"/>
-                <w:szCs w:val="20"/>
+                <w:sz w:val="18"/>
+                <w:szCs w:val="18"/>
               </w:rPr>
-              <w:t>Matrícula</w:t>
+              <w:t>26-O</w:t>
             </w:r>
           </w:p>
         </w:tc>
         <w:tc>
           <w:tcPr>
-            <w:tcW w:w="1890" w:type="dxa"/>
+            <w:tcW w:w="1694" w:type="dxa"/>
             <w:tcBorders>
-              <w:top w:val="single" w:sz="4" w:space="0" w:color="000000"/>
+              <w:start w:val="single" w:sz="4" w:space="0" w:color="000000"/>
               <w:bottom w:val="single" w:sz="4" w:space="0" w:color="000000"/>
-              <w:end w:val="single" w:sz="4" w:space="0" w:color="000000"/>
             </w:tcBorders>
-            <w:shd w:fill="FAC090" w:val="clear"/>
+            <w:shd w:fill="FFFFFF" w:val="clear"/>
+            <w:vAlign w:val="center"/>
+          </w:tcPr>
+          <w:p>
+            <w:pPr>
+              <w:pStyle w:val="normal1"/>
+              <w:widowControl/>
+              <w:jc w:val="center"/>
+              <w:rPr>
+                <w:rFonts w:ascii="Times New Roman" w:hAnsi="Times New Roman" w:eastAsia="Times New Roman" w:cs="Times New Roman"/>
+                <w:b w:val="false"/>
+                <w:bCs w:val="false"/>
+                <w:color w:val="000000"/>
+                <w:sz w:val="18"/>
+                <w:szCs w:val="18"/>
+              </w:rPr>
+            </w:pPr>
+            <w:r>
+              <w:rPr>
+                <w:rFonts w:eastAsia="Times New Roman" w:cs="Times New Roman" w:ascii="Times New Roman" w:hAnsi="Times New Roman"/>
+                <w:b w:val="false"/>
+                <w:bCs w:val="false"/>
+                <w:color w:val="000000"/>
+                <w:sz w:val="18"/>
+                <w:szCs w:val="18"/>
+              </w:rPr>
+              <w:t>2263045167</w:t>
+            </w:r>
+          </w:p>
+        </w:tc>
+        <w:tc>
+          <w:tcPr>
+            <w:tcW w:w="1891" w:type="dxa"/>
+            <w:tcBorders>
+              <w:start w:val="single" w:sz="4" w:space="0" w:color="000000"/>
+              <w:bottom w:val="single" w:sz="4" w:space="0" w:color="000000"/>
+            </w:tcBorders>
+            <w:shd w:fill="FFFFFF" w:val="clear"/>
             <w:vAlign w:val="center"/>
           </w:tcPr>
           <w:p>
@@ -1095,40 +1288,34 @@
               <w:widowControl/>
               <w:rPr>
                 <w:rFonts w:ascii="Times New Roman" w:hAnsi="Times New Roman" w:eastAsia="Times New Roman" w:cs="Times New Roman"/>
+                <w:b w:val="false"/>
+                <w:bCs w:val="false"/>
                 <w:color w:val="000000"/>
-                <w:sz w:val="20"/>
-                <w:szCs w:val="20"/>
+                <w:sz w:val="18"/>
+                <w:szCs w:val="18"/>
               </w:rPr>
             </w:pPr>
             <w:r>
               <w:rPr>
                 <w:rFonts w:eastAsia="Times New Roman" w:cs="Times New Roman" w:ascii="Times New Roman" w:hAnsi="Times New Roman"/>
+                <w:b w:val="false"/>
+                <w:bCs w:val="false"/>
                 <w:color w:val="000000"/>
-                <w:sz w:val="20"/>
-                <w:szCs w:val="20"/>
+                <w:sz w:val="18"/>
+                <w:szCs w:val="18"/>
               </w:rPr>
-              <w:t xml:space="preserve">Apellido </w:t>
-            </w:r>
-            <w:r>
-              <w:rPr>
-                <w:rFonts w:eastAsia="Times New Roman" w:cs="Times New Roman" w:ascii="Times New Roman" w:hAnsi="Times New Roman"/>
-                <w:color w:val="000000"/>
-                <w:sz w:val="20"/>
-                <w:szCs w:val="20"/>
-              </w:rPr>
-              <w:t>paterno</w:t>
+              <w:t>GONZÁLEZ</w:t>
             </w:r>
           </w:p>
         </w:tc>
         <w:tc>
           <w:tcPr>
-            <w:tcW w:w="2070" w:type="dxa"/>
+            <w:tcW w:w="2069" w:type="dxa"/>
             <w:tcBorders>
-              <w:top w:val="single" w:sz="4" w:space="0" w:color="000000"/>
+              <w:start w:val="single" w:sz="4" w:space="0" w:color="000000"/>
               <w:bottom w:val="single" w:sz="4" w:space="0" w:color="000000"/>
-              <w:end w:val="single" w:sz="4" w:space="0" w:color="000000"/>
             </w:tcBorders>
-            <w:shd w:fill="FAC090" w:val="clear"/>
+            <w:shd w:fill="FFFFFF" w:val="clear"/>
             <w:vAlign w:val="center"/>
           </w:tcPr>
           <w:p>
@@ -1137,40 +1324,35 @@
               <w:widowControl/>
               <w:rPr>
                 <w:rFonts w:ascii="Times New Roman" w:hAnsi="Times New Roman" w:eastAsia="Times New Roman" w:cs="Times New Roman"/>
+                <w:b w:val="false"/>
+                <w:bCs w:val="false"/>
                 <w:color w:val="000000"/>
-                <w:sz w:val="20"/>
-                <w:szCs w:val="20"/>
+                <w:sz w:val="18"/>
+                <w:szCs w:val="18"/>
               </w:rPr>
             </w:pPr>
             <w:r>
               <w:rPr>
                 <w:rFonts w:eastAsia="Times New Roman" w:cs="Times New Roman" w:ascii="Times New Roman" w:hAnsi="Times New Roman"/>
+                <w:b w:val="false"/>
+                <w:bCs w:val="false"/>
                 <w:color w:val="000000"/>
-                <w:sz w:val="20"/>
-                <w:szCs w:val="20"/>
+                <w:sz w:val="18"/>
+                <w:szCs w:val="18"/>
               </w:rPr>
-              <w:t xml:space="preserve">Apellido </w:t>
-            </w:r>
-            <w:r>
-              <w:rPr>
-                <w:rFonts w:eastAsia="Times New Roman" w:cs="Times New Roman" w:ascii="Times New Roman" w:hAnsi="Times New Roman"/>
-                <w:color w:val="000000"/>
-                <w:sz w:val="20"/>
-                <w:szCs w:val="20"/>
-              </w:rPr>
-              <w:t>materno</w:t>
+              <w:t>PÉREZ</w:t>
             </w:r>
           </w:p>
         </w:tc>
         <w:tc>
           <w:tcPr>
-            <w:tcW w:w="2175" w:type="dxa"/>
+            <w:tcW w:w="2176" w:type="dxa"/>
             <w:tcBorders>
-              <w:top w:val="single" w:sz="4" w:space="0" w:color="000000"/>
+              <w:start w:val="single" w:sz="4" w:space="0" w:color="000000"/>
               <w:bottom w:val="single" w:sz="4" w:space="0" w:color="000000"/>
               <w:end w:val="single" w:sz="4" w:space="0" w:color="000000"/>
             </w:tcBorders>
-            <w:shd w:fill="FAC090" w:val="clear"/>
+            <w:shd w:fill="FFFFFF" w:val="clear"/>
             <w:vAlign w:val="center"/>
           </w:tcPr>
           <w:p>
@@ -1179,19 +1361,23 @@
               <w:widowControl/>
               <w:rPr>
                 <w:rFonts w:ascii="Times New Roman" w:hAnsi="Times New Roman" w:eastAsia="Times New Roman" w:cs="Times New Roman"/>
+                <w:b w:val="false"/>
+                <w:bCs w:val="false"/>
                 <w:color w:val="000000"/>
-                <w:sz w:val="20"/>
-                <w:szCs w:val="20"/>
+                <w:sz w:val="18"/>
+                <w:szCs w:val="18"/>
               </w:rPr>
             </w:pPr>
             <w:r>
               <w:rPr>
                 <w:rFonts w:eastAsia="Times New Roman" w:cs="Times New Roman" w:ascii="Times New Roman" w:hAnsi="Times New Roman"/>
+                <w:b w:val="false"/>
+                <w:bCs w:val="false"/>
                 <w:color w:val="000000"/>
-                <w:sz w:val="20"/>
-                <w:szCs w:val="20"/>
+                <w:sz w:val="18"/>
+                <w:szCs w:val="18"/>
               </w:rPr>
-              <w:t>Nombre</w:t>
+              <w:t>ANTONIO</w:t>
             </w:r>
           </w:p>
         </w:tc>
@@ -1341,7 +1527,7 @@
           <w:color w:val="000000"/>
         </w:rPr>
         <w:drawing>
-          <wp:anchor distT="0" distB="0" distL="0" distR="0" simplePos="0" relativeHeight="9" behindDoc="1" locked="0" layoutInCell="1" allowOverlap="1">
+          <wp:anchor distT="0" distB="0" distL="0" distR="0" simplePos="0" relativeHeight="6" behindDoc="1" locked="0" layoutInCell="1" allowOverlap="1">
             <wp:simplePos x="0" y="0"/>
             <wp:positionH relativeFrom="column">
               <wp:posOffset>71755</wp:posOffset>
@@ -1531,14 +1717,18 @@
                         <w:txbxContent>
                           <w:p>
                             <w:pPr>
-                              <w:pStyle w:val="FrameContents"/>
+                              <w:pStyle w:val="FrameContentsuser"/>
                               <w:spacing w:lineRule="auto" w:line="240" w:before="0" w:after="0"/>
                               <w:ind w:hanging="0" w:start="0" w:end="0"/>
                               <w:jc w:val="start"/>
-                              <w:rPr/>
+                              <w:rPr>
+                                <w:color w:val="000000"/>
+                              </w:rPr>
                             </w:pPr>
                             <w:r>
-                              <w:rPr/>
+                              <w:rPr>
+                                <w:color w:val="000000"/>
+                              </w:rPr>
                             </w:r>
                           </w:p>
                         </w:txbxContent>
@@ -1561,14 +1751,18 @@
                   <w:txbxContent>
                     <w:p>
                       <w:pPr>
-                        <w:pStyle w:val="FrameContents"/>
+                        <w:pStyle w:val="FrameContentsuser"/>
                         <w:spacing w:lineRule="auto" w:line="240" w:before="0" w:after="0"/>
                         <w:ind w:hanging="0" w:start="0" w:end="0"/>
                         <w:jc w:val="start"/>
-                        <w:rPr/>
+                        <w:rPr>
+                          <w:color w:val="000000"/>
+                        </w:rPr>
                       </w:pPr>
                       <w:r>
-                        <w:rPr/>
+                        <w:rPr>
+                          <w:color w:val="000000"/>
+                        </w:rPr>
                       </w:r>
                     </w:p>
                   </w:txbxContent>
@@ -1737,6 +1931,7 @@
     <w:name w:val="Normal"/>
     <w:pPr>
       <w:widowControl w:val="false"/>
+      <w:suppressAutoHyphens w:val="true"/>
       <w:bidi w:val="0"/>
       <w:spacing w:before="0" w:after="0"/>
       <w:jc w:val="start"/>
@@ -1933,6 +2128,7 @@
     <w:name w:val="normal1"/>
     <w:pPr>
       <w:widowControl w:val="false"/>
+      <w:suppressAutoHyphens w:val="true"/>
       <w:bidi w:val="0"/>
       <w:spacing w:before="0" w:after="0"/>
       <w:jc w:val="start"/>
@@ -2002,15 +2198,15 @@
       <w:lang w:val="es-MX" w:eastAsia="es-MX" w:bidi="ar-SA"/>
     </w:rPr>
   </w:style>
-  <w:style w:type="paragraph" w:styleId="FrameContentsuser">
-    <w:name w:val="Frame Contents (user)"/>
+  <w:style w:type="paragraph" w:styleId="FrameContents">
+    <w:name w:val="Frame Contents"/>
     <w:basedOn w:val="normal1"/>
     <w:qFormat/>
     <w:pPr/>
     <w:rPr/>
   </w:style>
-  <w:style w:type="paragraph" w:styleId="FrameContents">
-    <w:name w:val="Frame Contents"/>
+  <w:style w:type="paragraph" w:styleId="FrameContentsuser">
+    <w:name w:val="Frame Contents (user)"/>
     <w:basedOn w:val="normal1"/>
     <w:qFormat/>
     <w:pPr/>
@@ -2032,6 +2228,27 @@
       <w:color w:val="666666"/>
       <w:sz w:val="48"/>
       <w:szCs w:val="48"/>
+    </w:rPr>
+  </w:style>
+  <w:style w:type="paragraph" w:styleId="TableContents">
+    <w:name w:val="Table Contents"/>
+    <w:basedOn w:val="Normal"/>
+    <w:pPr>
+      <w:widowControl w:val="false"/>
+      <w:suppressLineNumbers/>
+    </w:pPr>
+    <w:rPr/>
+  </w:style>
+  <w:style w:type="paragraph" w:styleId="TableHeading">
+    <w:name w:val="Table Heading"/>
+    <w:basedOn w:val="TableContents"/>
+    <w:pPr>
+      <w:suppressLineNumbers/>
+      <w:jc w:val="center"/>
+    </w:pPr>
+    <w:rPr>
+      <w:b/>
+      <w:bCs/>
     </w:rPr>
   </w:style>
   <w:style w:type="numbering" w:styleId="NoList" w:default="1">

</xml_diff>